<commit_message>
Stelle auf Stichtag 31.12.2021 um
</commit_message>
<xml_diff>
--- a/02_prepare_area_data.docx
+++ b/02_prepare_area_data.docx
@@ -18,7 +18,7 @@
         <w:t xml:space="preserve">Matthias Lochmann</w:t>
       </w:r>
     </w:p>
-    <w:bookmarkStart w:id="27" w:name="gis-übersicht"/>
+    <w:bookmarkStart w:id="33" w:name="gis-übersicht"/>
     <w:p>
       <w:pPr>
         <w:pStyle w:val="Heading2"/>
@@ -42,7 +42,7 @@
           <w:rPr>
             <w:rStyle w:val="Hyperlink"/>
           </w:rPr>
-          <w:t xml:space="preserve">GIS-Daten der Gemeinden</w:t>
+          <w:t xml:space="preserve">Verwaltungsgebiete 1:250 000 des BKG Stand 31.12.2021</w:t>
         </w:r>
       </w:hyperlink>
       <w:r>
@@ -69,7 +69,7 @@
         <w:rPr>
           <w:rStyle w:val="VerbatimChar"/>
         </w:rPr>
-        <w:t xml:space="preserve">  `C:\Users\lochmannm\Documents\GitHub\END2DALY\data\Gebietstabellen\raw\DE_VG250.gpkg' </w:t>
+        <w:t xml:space="preserve">  `C:\Users\lochmannm\Documents\GitHub\END2DALY\data\Gebietstabellen\raw\DE_VG250EW_31122021.gpkg' </w:t>
       </w:r>
       <w:r>
         <w:br/>
@@ -87,7 +87,7 @@
         <w:rPr>
           <w:rStyle w:val="VerbatimChar"/>
         </w:rPr>
-        <w:t xml:space="preserve">Simple feature collection with 11103 features and 26 fields</w:t>
+        <w:t xml:space="preserve">Simple feature collection with 11123 features and 27 fields</w:t>
       </w:r>
       <w:r>
         <w:br/>
@@ -178,324 +178,7 @@
         <w:pStyle w:val="BodyText"/>
       </w:pPr>
       <w:r>
-        <w:t xml:space="preserve">Statistik über die Gemeinden in Deutschland:</w:t>
-      </w:r>
-    </w:p>
-    <w:tbl>
-      <w:tblPr>
-        <w:tblStyle w:val="Table"/>
-        <w:tblW w:type="auto" w:w="0"/>
-        <w:tblLook w:firstRow="1" w:lastRow="0" w:firstColumn="0" w:lastColumn="0" w:noHBand="0" w:noVBand="0" w:val="0020"/>
-      </w:tblPr>
-      <w:tblGrid>
-        <w:gridCol w:w="2640"/>
-        <w:gridCol w:w="2640"/>
-        <w:gridCol w:w="2640"/>
-      </w:tblGrid>
-      <w:tr>
-        <w:trPr>
-          <w:tblHeader w:val="on"/>
-        </w:trPr>
-        <w:tc>
-          <w:tcPr/>
-          <w:p>
-            <w:pPr>
-              <w:pStyle w:val="Compact"/>
-              <w:jc w:val="left"/>
-            </w:pPr>
-            <w:r>
-              <w:t xml:space="preserve">BEM</w:t>
-            </w:r>
-          </w:p>
-        </w:tc>
-        <w:tc>
-          <w:tcPr/>
-          <w:p>
-            <w:pPr>
-              <w:pStyle w:val="Compact"/>
-              <w:jc w:val="left"/>
-            </w:pPr>
-            <w:r>
-              <w:t xml:space="preserve">BEZ</w:t>
-            </w:r>
-          </w:p>
-        </w:tc>
-        <w:tc>
-          <w:tcPr/>
-          <w:p>
-            <w:pPr>
-              <w:pStyle w:val="Compact"/>
-              <w:jc w:val="right"/>
-            </w:pPr>
-            <w:r>
-              <w:t xml:space="preserve">n</w:t>
-            </w:r>
-          </w:p>
-        </w:tc>
-      </w:tr>
-      <w:tr>
-        <w:tc>
-          <w:tcPr/>
-          <w:p>
-            <w:pPr>
-              <w:pStyle w:val="Compact"/>
-              <w:jc w:val="left"/>
-            </w:pPr>
-            <w:r>
-              <w:t xml:space="preserve">–</w:t>
-            </w:r>
-          </w:p>
-        </w:tc>
-        <w:tc>
-          <w:tcPr/>
-          <w:p>
-            <w:pPr>
-              <w:pStyle w:val="Compact"/>
-              <w:jc w:val="left"/>
-            </w:pPr>
-            <w:r>
-              <w:t xml:space="preserve">Gemeinde</w:t>
-            </w:r>
-          </w:p>
-        </w:tc>
-        <w:tc>
-          <w:tcPr/>
-          <w:p>
-            <w:pPr>
-              <w:pStyle w:val="Compact"/>
-              <w:jc w:val="right"/>
-            </w:pPr>
-            <w:r>
-              <w:t xml:space="preserve">1747</w:t>
-            </w:r>
-          </w:p>
-        </w:tc>
-      </w:tr>
-      <w:tr>
-        <w:tc>
-          <w:tcPr/>
-          <w:p>
-            <w:pPr>
-              <w:pStyle w:val="Compact"/>
-              <w:jc w:val="left"/>
-            </w:pPr>
-            <w:r>
-              <w:t xml:space="preserve">–</w:t>
-            </w:r>
-          </w:p>
-        </w:tc>
-        <w:tc>
-          <w:tcPr/>
-          <w:p>
-            <w:pPr>
-              <w:pStyle w:val="Compact"/>
-              <w:jc w:val="left"/>
-            </w:pPr>
-            <w:r>
-              <w:t xml:space="preserve">Gemeindefreies Gebiet</w:t>
-            </w:r>
-          </w:p>
-        </w:tc>
-        <w:tc>
-          <w:tcPr/>
-          <w:p>
-            <w:pPr>
-              <w:pStyle w:val="Compact"/>
-              <w:jc w:val="right"/>
-            </w:pPr>
-            <w:r>
-              <w:t xml:space="preserve">198</w:t>
-            </w:r>
-          </w:p>
-        </w:tc>
-      </w:tr>
-      <w:tr>
-        <w:tc>
-          <w:tcPr/>
-          <w:p>
-            <w:pPr>
-              <w:pStyle w:val="Compact"/>
-              <w:jc w:val="left"/>
-            </w:pPr>
-            <w:r>
-              <w:t xml:space="preserve">–</w:t>
-            </w:r>
-          </w:p>
-        </w:tc>
-        <w:tc>
-          <w:tcPr/>
-          <w:p>
-            <w:pPr>
-              <w:pStyle w:val="Compact"/>
-              <w:jc w:val="left"/>
-            </w:pPr>
-            <w:r>
-              <w:t xml:space="preserve">Stadt</w:t>
-            </w:r>
-          </w:p>
-        </w:tc>
-        <w:tc>
-          <w:tcPr/>
-          <w:p>
-            <w:pPr>
-              <w:pStyle w:val="Compact"/>
-              <w:jc w:val="right"/>
-            </w:pPr>
-            <w:r>
-              <w:t xml:space="preserve">1333</w:t>
-            </w:r>
-          </w:p>
-        </w:tc>
-      </w:tr>
-      <w:tr>
-        <w:tc>
-          <w:tcPr/>
-          <w:p>
-            <w:pPr>
-              <w:pStyle w:val="Compact"/>
-              <w:jc w:val="left"/>
-            </w:pPr>
-            <w:r>
-              <w:t xml:space="preserve">gemeinschaftsangehörig</w:t>
-            </w:r>
-          </w:p>
-        </w:tc>
-        <w:tc>
-          <w:tcPr/>
-          <w:p>
-            <w:pPr>
-              <w:pStyle w:val="Compact"/>
-              <w:jc w:val="left"/>
-            </w:pPr>
-            <w:r>
-              <w:t xml:space="preserve">Gemeinde</w:t>
-            </w:r>
-          </w:p>
-        </w:tc>
-        <w:tc>
-          <w:tcPr/>
-          <w:p>
-            <w:pPr>
-              <w:pStyle w:val="Compact"/>
-              <w:jc w:val="right"/>
-            </w:pPr>
-            <w:r>
-              <w:t xml:space="preserve">6948</w:t>
-            </w:r>
-          </w:p>
-        </w:tc>
-      </w:tr>
-      <w:tr>
-        <w:tc>
-          <w:tcPr/>
-          <w:p>
-            <w:pPr>
-              <w:pStyle w:val="Compact"/>
-              <w:jc w:val="left"/>
-            </w:pPr>
-            <w:r>
-              <w:t xml:space="preserve">gemeinschaftsangehörig</w:t>
-            </w:r>
-          </w:p>
-        </w:tc>
-        <w:tc>
-          <w:tcPr/>
-          <w:p>
-            <w:pPr>
-              <w:pStyle w:val="Compact"/>
-              <w:jc w:val="left"/>
-            </w:pPr>
-            <w:r>
-              <w:t xml:space="preserve">Stadt</w:t>
-            </w:r>
-          </w:p>
-        </w:tc>
-        <w:tc>
-          <w:tcPr/>
-          <w:p>
-            <w:pPr>
-              <w:pStyle w:val="Compact"/>
-              <w:jc w:val="right"/>
-            </w:pPr>
-            <w:r>
-              <w:t xml:space="preserve">617</w:t>
-            </w:r>
-          </w:p>
-        </w:tc>
-      </w:tr>
-      <w:tr>
-        <w:tc>
-          <w:tcPr/>
-          <w:p>
-            <w:pPr>
-              <w:pStyle w:val="Compact"/>
-              <w:jc w:val="left"/>
-            </w:pPr>
-            <w:r>
-              <w:t xml:space="preserve">kreisfrei</w:t>
-            </w:r>
-          </w:p>
-        </w:tc>
-        <w:tc>
-          <w:tcPr/>
-          <w:p>
-            <w:pPr>
-              <w:pStyle w:val="Compact"/>
-              <w:jc w:val="left"/>
-            </w:pPr>
-            <w:r>
-              <w:t xml:space="preserve">Stadt</w:t>
-            </w:r>
-          </w:p>
-        </w:tc>
-        <w:tc>
-          <w:tcPr/>
-          <w:p>
-            <w:pPr>
-              <w:pStyle w:val="Compact"/>
-              <w:jc w:val="right"/>
-            </w:pPr>
-            <w:r>
-              <w:t xml:space="preserve">106</w:t>
-            </w:r>
-          </w:p>
-        </w:tc>
-      </w:tr>
-    </w:tbl>
-    <w:p>
-      <w:pPr>
-        <w:pStyle w:val="BodyText"/>
-      </w:pPr>
-      <w:r>
-        <w:t xml:space="preserve">In den Gemeinden gibt es folgende Dubletten:</w:t>
-      </w:r>
-    </w:p>
-    <w:p>
-      <w:pPr>
-        <w:pStyle w:val="SourceCode"/>
-      </w:pPr>
-      <w:r>
-        <w:rPr>
-          <w:rStyle w:val="VerbatimChar"/>
-        </w:rPr>
-        <w:t xml:space="preserve">[1] AGS n  </w:t>
-      </w:r>
-      <w:r>
-        <w:br/>
-      </w:r>
-      <w:r>
-        <w:rPr>
-          <w:rStyle w:val="VerbatimChar"/>
-        </w:rPr>
-        <w:t xml:space="preserve">&lt;0 Zeilen&gt; (oder row.names mit Länge 0)</w:t>
-      </w:r>
-    </w:p>
-    <w:p>
-      <w:pPr>
-        <w:pStyle w:val="FirstParagraph"/>
-      </w:pPr>
-      <w:r>
-        <w:t xml:space="preserve">Zusammen mit den Informationen aus der im ersten Schritt generierten Tabelle lässt sich beispielsweise eine Bevölkerungdichtekarte darstellen:</w:t>
+        <w:t xml:space="preserve">Die Daten enthalten auch Bevölkerung und Katasterfläche; daraus ergibt sich auch die Bevölkerungsdichte:</w:t>
       </w:r>
     </w:p>
     <w:p>
@@ -512,7 +195,7 @@
               <a:graphicData uri="http://schemas.openxmlformats.org/drawingml/2006/picture">
                 <pic:pic>
                   <pic:nvPicPr>
-                    <pic:cNvPr descr="02_prepare_area_data_files/figure-docx/gis_visualisierung_vg250-1.png" id="26" name="Picture"/>
+                    <pic:cNvPr descr="02_prepare_area_data_files/figure-docx/Bevoelkerungsdichtekarte-1.png" id="26" name="Picture"/>
                     <pic:cNvPicPr>
                       <a:picLocks noChangeArrowheads="1" noChangeAspect="1"/>
                     </pic:cNvPicPr>
@@ -545,22 +228,414 @@
         </w:drawing>
       </w:r>
     </w:p>
-    <w:bookmarkEnd w:id="27"/>
-    <w:bookmarkStart w:id="31" w:name="expositionsdaten-räumlich-visualisieren"/>
     <w:p>
       <w:pPr>
-        <w:pStyle w:val="Heading2"/>
-      </w:pPr>
-      <w:r>
-        <w:t xml:space="preserve">Expositionsdaten räumlich visualisieren</w:t>
+        <w:pStyle w:val="BodyText"/>
+      </w:pPr>
+      <w:r>
+        <w:t xml:space="preserve">Statistik über die Gemeinden in Deutschland:</w:t>
+      </w:r>
+    </w:p>
+    <w:tbl>
+      <w:tblPr>
+        <w:tblStyle w:val="Table"/>
+        <w:tblW w:type="auto" w:w="0"/>
+        <w:tblLook w:firstRow="1" w:lastRow="0" w:firstColumn="0" w:lastColumn="0" w:noHBand="0" w:noVBand="0" w:val="0020"/>
+      </w:tblPr>
+      <w:tblGrid>
+        <w:gridCol w:w="1980"/>
+        <w:gridCol w:w="1980"/>
+        <w:gridCol w:w="1980"/>
+        <w:gridCol w:w="1980"/>
+      </w:tblGrid>
+      <w:tr>
+        <w:trPr>
+          <w:tblHeader w:val="on"/>
+        </w:trPr>
+        <w:tc>
+          <w:tcPr/>
+          <w:p>
+            <w:pPr>
+              <w:pStyle w:val="Compact"/>
+              <w:jc w:val="left"/>
+            </w:pPr>
+            <w:r>
+              <w:t xml:space="preserve">BEM</w:t>
+            </w:r>
+          </w:p>
+        </w:tc>
+        <w:tc>
+          <w:tcPr/>
+          <w:p>
+            <w:pPr>
+              <w:pStyle w:val="Compact"/>
+              <w:jc w:val="left"/>
+            </w:pPr>
+            <w:r>
+              <w:t xml:space="preserve">BEZ</w:t>
+            </w:r>
+          </w:p>
+        </w:tc>
+        <w:tc>
+          <w:tcPr/>
+          <w:p>
+            <w:pPr>
+              <w:pStyle w:val="Compact"/>
+              <w:jc w:val="right"/>
+            </w:pPr>
+            <w:r>
+              <w:t xml:space="preserve">n</w:t>
+            </w:r>
+          </w:p>
+        </w:tc>
+        <w:tc>
+          <w:tcPr/>
+          <w:p>
+            <w:pPr>
+              <w:pStyle w:val="Compact"/>
+              <w:jc w:val="right"/>
+            </w:pPr>
+            <w:r>
+              <w:t xml:space="preserve">Bevölkerung</w:t>
+            </w:r>
+          </w:p>
+        </w:tc>
+      </w:tr>
+      <w:tr>
+        <w:tc>
+          <w:tcPr/>
+          <w:p>
+            <w:pPr>
+              <w:pStyle w:val="Compact"/>
+              <w:jc w:val="left"/>
+            </w:pPr>
+            <w:r>
+              <w:t xml:space="preserve">–</w:t>
+            </w:r>
+          </w:p>
+        </w:tc>
+        <w:tc>
+          <w:tcPr/>
+          <w:p>
+            <w:pPr>
+              <w:pStyle w:val="Compact"/>
+              <w:jc w:val="left"/>
+            </w:pPr>
+            <w:r>
+              <w:t xml:space="preserve">Gemeinde</w:t>
+            </w:r>
+          </w:p>
+        </w:tc>
+        <w:tc>
+          <w:tcPr/>
+          <w:p>
+            <w:pPr>
+              <w:pStyle w:val="Compact"/>
+              <w:jc w:val="right"/>
+            </w:pPr>
+            <w:r>
+              <w:t xml:space="preserve">1748</w:t>
+            </w:r>
+          </w:p>
+        </w:tc>
+        <w:tc>
+          <w:tcPr/>
+          <w:p>
+            <w:pPr>
+              <w:pStyle w:val="Compact"/>
+              <w:jc w:val="right"/>
+            </w:pPr>
+            <w:r>
+              <w:t xml:space="preserve">12163089</w:t>
+            </w:r>
+          </w:p>
+        </w:tc>
+      </w:tr>
+      <w:tr>
+        <w:tc>
+          <w:tcPr/>
+          <w:p>
+            <w:pPr>
+              <w:pStyle w:val="Compact"/>
+              <w:jc w:val="left"/>
+            </w:pPr>
+            <w:r>
+              <w:t xml:space="preserve">–</w:t>
+            </w:r>
+          </w:p>
+        </w:tc>
+        <w:tc>
+          <w:tcPr/>
+          <w:p>
+            <w:pPr>
+              <w:pStyle w:val="Compact"/>
+              <w:jc w:val="left"/>
+            </w:pPr>
+            <w:r>
+              <w:t xml:space="preserve">Gemeindefreies Gebiet</w:t>
+            </w:r>
+          </w:p>
+        </w:tc>
+        <w:tc>
+          <w:tcPr/>
+          <w:p>
+            <w:pPr>
+              <w:pStyle w:val="Compact"/>
+              <w:jc w:val="right"/>
+            </w:pPr>
+            <w:r>
+              <w:t xml:space="preserve">207</w:t>
+            </w:r>
+          </w:p>
+        </w:tc>
+        <w:tc>
+          <w:tcPr/>
+          <w:p>
+            <w:pPr>
+              <w:pStyle w:val="Compact"/>
+              <w:jc w:val="right"/>
+            </w:pPr>
+            <w:r>
+              <w:t xml:space="preserve">4841</w:t>
+            </w:r>
+          </w:p>
+        </w:tc>
+      </w:tr>
+      <w:tr>
+        <w:tc>
+          <w:tcPr/>
+          <w:p>
+            <w:pPr>
+              <w:pStyle w:val="Compact"/>
+              <w:jc w:val="left"/>
+            </w:pPr>
+            <w:r>
+              <w:t xml:space="preserve">–</w:t>
+            </w:r>
+          </w:p>
+        </w:tc>
+        <w:tc>
+          <w:tcPr/>
+          <w:p>
+            <w:pPr>
+              <w:pStyle w:val="Compact"/>
+              <w:jc w:val="left"/>
+            </w:pPr>
+            <w:r>
+              <w:t xml:space="preserve">Stadt</w:t>
+            </w:r>
+          </w:p>
+        </w:tc>
+        <w:tc>
+          <w:tcPr/>
+          <w:p>
+            <w:pPr>
+              <w:pStyle w:val="Compact"/>
+              <w:jc w:val="right"/>
+            </w:pPr>
+            <w:r>
+              <w:t xml:space="preserve">1334</w:t>
+            </w:r>
+          </w:p>
+        </w:tc>
+        <w:tc>
+          <w:tcPr/>
+          <w:p>
+            <w:pPr>
+              <w:pStyle w:val="Compact"/>
+              <w:jc w:val="right"/>
+            </w:pPr>
+            <w:r>
+              <w:t xml:space="preserve">28334670</w:t>
+            </w:r>
+          </w:p>
+        </w:tc>
+      </w:tr>
+      <w:tr>
+        <w:tc>
+          <w:tcPr/>
+          <w:p>
+            <w:pPr>
+              <w:pStyle w:val="Compact"/>
+              <w:jc w:val="left"/>
+            </w:pPr>
+            <w:r>
+              <w:t xml:space="preserve">gemeinschaftsangehörig</w:t>
+            </w:r>
+          </w:p>
+        </w:tc>
+        <w:tc>
+          <w:tcPr/>
+          <w:p>
+            <w:pPr>
+              <w:pStyle w:val="Compact"/>
+              <w:jc w:val="left"/>
+            </w:pPr>
+            <w:r>
+              <w:t xml:space="preserve">Gemeinde</w:t>
+            </w:r>
+          </w:p>
+        </w:tc>
+        <w:tc>
+          <w:tcPr/>
+          <w:p>
+            <w:pPr>
+              <w:pStyle w:val="Compact"/>
+              <w:jc w:val="right"/>
+            </w:pPr>
+            <w:r>
+              <w:t xml:space="preserve">6985</w:t>
+            </w:r>
+          </w:p>
+        </w:tc>
+        <w:tc>
+          <w:tcPr/>
+          <w:p>
+            <w:pPr>
+              <w:pStyle w:val="Compact"/>
+              <w:jc w:val="right"/>
+            </w:pPr>
+            <w:r>
+              <w:t xml:space="preserve">10031999</w:t>
+            </w:r>
+          </w:p>
+        </w:tc>
+      </w:tr>
+      <w:tr>
+        <w:tc>
+          <w:tcPr/>
+          <w:p>
+            <w:pPr>
+              <w:pStyle w:val="Compact"/>
+              <w:jc w:val="left"/>
+            </w:pPr>
+            <w:r>
+              <w:t xml:space="preserve">gemeinschaftsangehörig</w:t>
+            </w:r>
+          </w:p>
+        </w:tc>
+        <w:tc>
+          <w:tcPr/>
+          <w:p>
+            <w:pPr>
+              <w:pStyle w:val="Compact"/>
+              <w:jc w:val="left"/>
+            </w:pPr>
+            <w:r>
+              <w:t xml:space="preserve">Stadt</w:t>
+            </w:r>
+          </w:p>
+        </w:tc>
+        <w:tc>
+          <w:tcPr/>
+          <w:p>
+            <w:pPr>
+              <w:pStyle w:val="Compact"/>
+              <w:jc w:val="right"/>
+            </w:pPr>
+            <w:r>
+              <w:t xml:space="preserve">614</w:t>
+            </w:r>
+          </w:p>
+        </w:tc>
+        <w:tc>
+          <w:tcPr/>
+          <w:p>
+            <w:pPr>
+              <w:pStyle w:val="Compact"/>
+              <w:jc w:val="right"/>
+            </w:pPr>
+            <w:r>
+              <w:t xml:space="preserve">5851463</w:t>
+            </w:r>
+          </w:p>
+        </w:tc>
+      </w:tr>
+      <w:tr>
+        <w:tc>
+          <w:tcPr/>
+          <w:p>
+            <w:pPr>
+              <w:pStyle w:val="Compact"/>
+              <w:jc w:val="left"/>
+            </w:pPr>
+            <w:r>
+              <w:t xml:space="preserve">kreisfrei</w:t>
+            </w:r>
+          </w:p>
+        </w:tc>
+        <w:tc>
+          <w:tcPr/>
+          <w:p>
+            <w:pPr>
+              <w:pStyle w:val="Compact"/>
+              <w:jc w:val="left"/>
+            </w:pPr>
+            <w:r>
+              <w:t xml:space="preserve">Stadt</w:t>
+            </w:r>
+          </w:p>
+        </w:tc>
+        <w:tc>
+          <w:tcPr/>
+          <w:p>
+            <w:pPr>
+              <w:pStyle w:val="Compact"/>
+              <w:jc w:val="right"/>
+            </w:pPr>
+            <w:r>
+              <w:t xml:space="preserve">106</w:t>
+            </w:r>
+          </w:p>
+        </w:tc>
+        <w:tc>
+          <w:tcPr/>
+          <w:p>
+            <w:pPr>
+              <w:pStyle w:val="Compact"/>
+              <w:jc w:val="right"/>
+            </w:pPr>
+            <w:r>
+              <w:t xml:space="preserve">26851062</w:t>
+            </w:r>
+          </w:p>
+        </w:tc>
+      </w:tr>
+    </w:tbl>
+    <w:p>
+      <w:pPr>
+        <w:pStyle w:val="BodyText"/>
+      </w:pPr>
+      <w:r>
+        <w:t xml:space="preserve">In den Gemeinden gibt es folgende Dubletten:</w:t>
       </w:r>
     </w:p>
     <w:p>
       <w:pPr>
+        <w:pStyle w:val="SourceCode"/>
+      </w:pPr>
+      <w:r>
+        <w:rPr>
+          <w:rStyle w:val="VerbatimChar"/>
+        </w:rPr>
+        <w:t xml:space="preserve">[1] AGS n  </w:t>
+      </w:r>
+      <w:r>
+        <w:br/>
+      </w:r>
+      <w:r>
+        <w:rPr>
+          <w:rStyle w:val="VerbatimChar"/>
+        </w:rPr>
+        <w:t xml:space="preserve">&lt;0 Zeilen&gt; (oder row.names mit Länge 0)</w:t>
+      </w:r>
+    </w:p>
+    <w:p>
+      <w:pPr>
         <w:pStyle w:val="FirstParagraph"/>
       </w:pPr>
       <w:r>
-        <w:t xml:space="preserve">Am Beispiel von Hessen wird der Umfang der Expositionsinformationen der verschiedenen Datenquellen visualiert:</w:t>
+        <w:t xml:space="preserve">Zusammen mit den Informationen aus der im ersten Schritt generierten Tabelle lässt sich beispielsweise eine Bevölkerungdichtekarte darstellen:</w:t>
       </w:r>
     </w:p>
     <w:p>
@@ -572,18 +647,18 @@
           <wp:inline>
             <wp:extent cx="4620126" cy="3696101"/>
             <wp:effectExtent b="0" l="0" r="0" t="0"/>
-            <wp:docPr descr="" title="" id="29" name="Picture"/>
+            <wp:docPr descr="" title="" id="28" name="Picture"/>
             <a:graphic>
               <a:graphicData uri="http://schemas.openxmlformats.org/drawingml/2006/picture">
                 <pic:pic>
                   <pic:nvPicPr>
-                    <pic:cNvPr descr="02_prepare_area_data_files/figure-docx/gis_expositionsdaten_plotten-1.png" id="30" name="Picture"/>
+                    <pic:cNvPr descr="02_prepare_area_data_files/figure-docx/gis_visualisierung_vg250-1.png" id="29" name="Picture"/>
                     <pic:cNvPicPr>
                       <a:picLocks noChangeArrowheads="1" noChangeAspect="1"/>
                     </pic:cNvPicPr>
                   </pic:nvPicPr>
                   <pic:blipFill>
-                    <a:blip r:embed="rId28"/>
+                    <a:blip r:embed="rId27"/>
                     <a:stretch>
                       <a:fillRect/>
                     </a:stretch>
@@ -610,7 +685,119 @@
         </w:drawing>
       </w:r>
     </w:p>
-    <w:bookmarkEnd w:id="31"/>
+    <w:p>
+      <w:pPr>
+        <w:pStyle w:val="BodyText"/>
+      </w:pPr>
+      <w:r>
+        <w:drawing>
+          <wp:inline>
+            <wp:extent cx="4620126" cy="3696101"/>
+            <wp:effectExtent b="0" l="0" r="0" t="0"/>
+            <wp:docPr descr="" title="" id="31" name="Picture"/>
+            <a:graphic>
+              <a:graphicData uri="http://schemas.openxmlformats.org/drawingml/2006/picture">
+                <pic:pic>
+                  <pic:nvPicPr>
+                    <pic:cNvPr descr="02_prepare_area_data_files/figure-docx/Daten_Bevoelkerung_Vgl-1.png" id="32" name="Picture"/>
+                    <pic:cNvPicPr>
+                      <a:picLocks noChangeArrowheads="1" noChangeAspect="1"/>
+                    </pic:cNvPicPr>
+                  </pic:nvPicPr>
+                  <pic:blipFill>
+                    <a:blip r:embed="rId30"/>
+                    <a:stretch>
+                      <a:fillRect/>
+                    </a:stretch>
+                  </pic:blipFill>
+                  <pic:spPr bwMode="auto">
+                    <a:xfrm>
+                      <a:off x="0" y="0"/>
+                      <a:ext cx="4620126" cy="3696101"/>
+                    </a:xfrm>
+                    <a:prstGeom prst="rect">
+                      <a:avLst/>
+                    </a:prstGeom>
+                    <a:noFill/>
+                    <a:ln w="9525">
+                      <a:noFill/>
+                      <a:headEnd/>
+                      <a:tailEnd/>
+                    </a:ln>
+                  </pic:spPr>
+                </pic:pic>
+              </a:graphicData>
+            </a:graphic>
+          </wp:inline>
+        </w:drawing>
+      </w:r>
+    </w:p>
+    <w:bookmarkEnd w:id="33"/>
+    <w:bookmarkStart w:id="37" w:name="expositionsdaten-räumlich-visualisieren"/>
+    <w:p>
+      <w:pPr>
+        <w:pStyle w:val="Heading2"/>
+      </w:pPr>
+      <w:r>
+        <w:t xml:space="preserve">Expositionsdaten räumlich visualisieren</w:t>
+      </w:r>
+    </w:p>
+    <w:p>
+      <w:pPr>
+        <w:pStyle w:val="FirstParagraph"/>
+      </w:pPr>
+      <w:r>
+        <w:t xml:space="preserve">Am Beispiel von Hessen wird der Umfang der Expositionsinformationen der verschiedenen Datenquellen visualiert:</w:t>
+      </w:r>
+    </w:p>
+    <w:p>
+      <w:pPr>
+        <w:pStyle w:val="BodyText"/>
+      </w:pPr>
+      <w:r>
+        <w:drawing>
+          <wp:inline>
+            <wp:extent cx="4620126" cy="3696101"/>
+            <wp:effectExtent b="0" l="0" r="0" t="0"/>
+            <wp:docPr descr="" title="" id="35" name="Picture"/>
+            <a:graphic>
+              <a:graphicData uri="http://schemas.openxmlformats.org/drawingml/2006/picture">
+                <pic:pic>
+                  <pic:nvPicPr>
+                    <pic:cNvPr descr="02_prepare_area_data_files/figure-docx/gis_expositionsdaten_plotten-1.png" id="36" name="Picture"/>
+                    <pic:cNvPicPr>
+                      <a:picLocks noChangeArrowheads="1" noChangeAspect="1"/>
+                    </pic:cNvPicPr>
+                  </pic:nvPicPr>
+                  <pic:blipFill>
+                    <a:blip r:embed="rId34"/>
+                    <a:stretch>
+                      <a:fillRect/>
+                    </a:stretch>
+                  </pic:blipFill>
+                  <pic:spPr bwMode="auto">
+                    <a:xfrm>
+                      <a:off x="0" y="0"/>
+                      <a:ext cx="4620126" cy="3696101"/>
+                    </a:xfrm>
+                    <a:prstGeom prst="rect">
+                      <a:avLst/>
+                    </a:prstGeom>
+                    <a:noFill/>
+                    <a:ln w="9525">
+                      <a:noFill/>
+                      <a:headEnd/>
+                      <a:tailEnd/>
+                    </a:ln>
+                  </pic:spPr>
+                </pic:pic>
+              </a:graphicData>
+            </a:graphic>
+          </wp:inline>
+        </w:drawing>
+      </w:r>
+    </w:p>
+    <w:bookmarkEnd w:id="37"/>
     <w:sectPr>
       <w:footnotePr>
         <w:numRestart w:val="eachSect"/>

</xml_diff>

<commit_message>
code refactoring and inclusion of age distribution data
</commit_message>
<xml_diff>
--- a/02_prepare_area_data.docx
+++ b/02_prepare_area_data.docx
@@ -18,13 +18,13 @@
         <w:t xml:space="preserve">Matthias Lochmann</w:t>
       </w:r>
     </w:p>
-    <w:bookmarkStart w:id="33" w:name="gis-übersicht"/>
+    <w:bookmarkStart w:id="10" w:name="bevölkerungsdaten-von-destatis"/>
     <w:p>
       <w:pPr>
         <w:pStyle w:val="Heading2"/>
       </w:pPr>
       <w:r>
-        <w:t xml:space="preserve">GIS-Übersicht</w:t>
+        <w:t xml:space="preserve">Bevölkerungsdaten von Destatis</w:t>
       </w:r>
     </w:p>
     <w:p>
@@ -32,12 +32,792 @@
         <w:pStyle w:val="FirstParagraph"/>
       </w:pPr>
       <w:r>
+        <w:t xml:space="preserve">Die Datei</w:t>
+      </w:r>
+    </w:p>
+    <w:p>
+      <w:pPr>
+        <w:pStyle w:val="SourceCode"/>
+      </w:pPr>
+      <w:r>
+        <w:rPr>
+          <w:rStyle w:val="VerbatimChar"/>
+        </w:rPr>
+        <w:t xml:space="preserve">[1] "data/Gebietstabellen/raw/GV100AD_31122021.txt"</w:t>
+      </w:r>
+    </w:p>
+    <w:p>
+      <w:pPr>
+        <w:pStyle w:val="FirstParagraph"/>
+      </w:pPr>
+      <w:r>
+        <w:t xml:space="preserve">liegt in einem</w:t>
+      </w:r>
+      <w:r>
+        <w:t xml:space="preserve"> </w:t>
+      </w:r>
+      <w:r>
+        <w:t xml:space="preserve">“fixed width”</w:t>
+      </w:r>
+      <w:r>
+        <w:t xml:space="preserve"> </w:t>
+      </w:r>
+      <w:r>
+        <w:t xml:space="preserve">Format vor, welches gut maschinen- aber schlecht menschenlesbar ist. Hier werden nur die relevanten Zeilen eingelesen,</w:t>
+      </w:r>
+    </w:p>
+    <w:p>
+      <w:pPr>
+        <w:pStyle w:val="BodyText"/>
+      </w:pPr>
+      <w:r>
+        <w:t xml:space="preserve">und die Felder</w:t>
+      </w:r>
+      <w:r>
+        <w:t xml:space="preserve"> </w:t>
+      </w:r>
+      <w:r>
+        <w:t xml:space="preserve">“gemeinde_kennziffer, gemeinde_bezeichnung, bevoelkerung,flaeche”</w:t>
+      </w:r>
+      <w:r>
+        <w:t xml:space="preserve"> </w:t>
+      </w:r>
+      <w:r>
+        <w:t xml:space="preserve">extrahiert. Zusätzlich werden aus Annex III des ETC-HE Reports 2023/11 die Bevölkerungsanteile der 7-17-jährigen Kinder und der Erwachsenen auf Staatsebene extrahiert - hier werden nun die Anteile für Deutschland pauschal auf alle Gemeinden verwendet, um so die Altersverteilung auf Gemeindeebene abzuschätzen.</w:t>
+      </w:r>
+    </w:p>
+    <w:p>
+      <w:pPr>
+        <w:pStyle w:val="BodyText"/>
+      </w:pPr>
+      <w:r>
+        <w:t xml:space="preserve">Ein Auszug daraus findet sich in</w:t>
+      </w:r>
+      <w:r>
+        <w:t xml:space="preserve"> </w:t>
+      </w:r>
+      <w:hyperlink w:anchor="tbl-gemeindeverzeichnis">
+        <w:r>
+          <w:rPr>
+            <w:rStyle w:val="Hyperlink"/>
+          </w:rPr>
+          <w:t xml:space="preserve">Table 1</w:t>
+        </w:r>
+      </w:hyperlink>
+      <w:r>
+        <w:t xml:space="preserve">.</w:t>
+      </w:r>
+    </w:p>
+    <w:tbl>
+      <w:tblPr>
+        <w:tblStyle w:val="Table"/>
+        <w:tblW w:type="pct" w:w="5000"/>
+        <w:tblLayout w:type="fixed"/>
+        <w:tblLook w:firstRow="0" w:lastRow="0" w:firstColumn="0" w:lastColumn="0" w:noHBand="0" w:noVBand="0" w:val="0000"/>
+      </w:tblPr>
+      <w:tblGrid>
+        <w:gridCol w:w="7920"/>
+      </w:tblGrid>
+      <w:tr>
+        <w:tc>
+          <w:tcPr/>
+          <w:bookmarkStart w:id="9" w:name="tbl-gemeindeverzeichnis"/>
+          <w:p>
+            <w:pPr>
+              <w:jc w:val="center"/>
+            </w:pPr>
+            <w:pPr>
+              <w:jc w:val="left"/>
+              <w:spacing w:before="200"/>
+              <w:pStyle w:val="ImageCaption"/>
+            </w:pPr>
+            <w:r>
+              <w:t xml:space="preserve">Table 1: Ein Auszug aus dem so gewonnenen Gemeindeverzeichnis</w:t>
+            </w:r>
+          </w:p>
+          <w:tbl>
+            <w:tblPr>
+              <w:tblStyle w:val="Table"/>
+              <w:tblW w:type="pct" w:w="5100"/>
+              <w:tblLayout w:type="fixed"/>
+              <w:tblLook w:firstRow="1" w:lastRow="0" w:firstColumn="0" w:lastColumn="0" w:noHBand="0" w:noVBand="0" w:val="0020"/>
+            </w:tblPr>
+            <w:tblGrid>
+              <w:gridCol w:w="1425"/>
+              <w:gridCol w:w="950"/>
+              <w:gridCol w:w="950"/>
+              <w:gridCol w:w="950"/>
+              <w:gridCol w:w="950"/>
+              <w:gridCol w:w="950"/>
+              <w:gridCol w:w="950"/>
+              <w:gridCol w:w="950"/>
+            </w:tblGrid>
+            <w:tr>
+              <w:trPr>
+                <w:tblHeader w:val="on"/>
+              </w:trPr>
+              <w:tc>
+                <w:tcPr/>
+                <w:p>
+                  <w:pPr>
+                    <w:pStyle w:val="Compact"/>
+                    <w:jc w:val="left"/>
+                    <w:jc w:val="center"/>
+                  </w:pPr>
+                  <w:r>
+                    <w:t xml:space="preserve">gemeinde_kennziffer</w:t>
+                  </w:r>
+                </w:p>
+              </w:tc>
+              <w:tc>
+                <w:tcPr/>
+                <w:p>
+                  <w:pPr>
+                    <w:pStyle w:val="Compact"/>
+                    <w:jc w:val="left"/>
+                    <w:jc w:val="center"/>
+                  </w:pPr>
+                  <w:r>
+                    <w:t xml:space="preserve">gemeinde_bezeichnung</w:t>
+                  </w:r>
+                </w:p>
+              </w:tc>
+              <w:tc>
+                <w:tcPr/>
+                <w:p>
+                  <w:pPr>
+                    <w:pStyle w:val="Compact"/>
+                    <w:jc w:val="left"/>
+                    <w:jc w:val="center"/>
+                  </w:pPr>
+                  <w:r>
+                    <w:t xml:space="preserve">gemeinde_kennzeichnung</w:t>
+                  </w:r>
+                </w:p>
+              </w:tc>
+              <w:tc>
+                <w:tcPr/>
+                <w:p>
+                  <w:pPr>
+                    <w:pStyle w:val="Compact"/>
+                    <w:jc w:val="right"/>
+                    <w:jc w:val="center"/>
+                  </w:pPr>
+                  <w:r>
+                    <w:t xml:space="preserve">bevoelkerung</w:t>
+                  </w:r>
+                </w:p>
+              </w:tc>
+              <w:tc>
+                <w:tcPr/>
+                <w:p>
+                  <w:pPr>
+                    <w:pStyle w:val="Compact"/>
+                    <w:jc w:val="right"/>
+                    <w:jc w:val="center"/>
+                  </w:pPr>
+                  <w:r>
+                    <w:t xml:space="preserve">flaeche</w:t>
+                  </w:r>
+                </w:p>
+              </w:tc>
+              <w:tc>
+                <w:tcPr/>
+                <w:p>
+                  <w:pPr>
+                    <w:pStyle w:val="Compact"/>
+                    <w:jc w:val="left"/>
+                    <w:jc w:val="center"/>
+                  </w:pPr>
+                  <w:r>
+                    <w:t xml:space="preserve">iso_code</w:t>
+                  </w:r>
+                </w:p>
+              </w:tc>
+              <w:tc>
+                <w:tcPr/>
+                <w:p>
+                  <w:pPr>
+                    <w:pStyle w:val="Compact"/>
+                    <w:jc w:val="right"/>
+                    <w:jc w:val="center"/>
+                  </w:pPr>
+                  <w:r>
+                    <w:t xml:space="preserve">bev_7_17</w:t>
+                  </w:r>
+                </w:p>
+              </w:tc>
+              <w:tc>
+                <w:tcPr/>
+                <w:p>
+                  <w:pPr>
+                    <w:pStyle w:val="Compact"/>
+                    <w:jc w:val="right"/>
+                    <w:jc w:val="center"/>
+                  </w:pPr>
+                  <w:r>
+                    <w:t xml:space="preserve">bev_adult</w:t>
+                  </w:r>
+                </w:p>
+              </w:tc>
+            </w:tr>
+            <w:tr>
+              <w:tc>
+                <w:tcPr/>
+                <w:p>
+                  <w:pPr>
+                    <w:pStyle w:val="Compact"/>
+                    <w:jc w:val="left"/>
+                    <w:jc w:val="center"/>
+                  </w:pPr>
+                  <w:r>
+                    <w:t xml:space="preserve">09571227</w:t>
+                  </w:r>
+                </w:p>
+              </w:tc>
+              <w:tc>
+                <w:tcPr/>
+                <w:p>
+                  <w:pPr>
+                    <w:pStyle w:val="Compact"/>
+                    <w:jc w:val="left"/>
+                    <w:jc w:val="center"/>
+                  </w:pPr>
+                  <w:r>
+                    <w:t xml:space="preserve">Wittelshofen</w:t>
+                  </w:r>
+                </w:p>
+              </w:tc>
+              <w:tc>
+                <w:tcPr/>
+                <w:p>
+                  <w:pPr>
+                    <w:pStyle w:val="Compact"/>
+                    <w:jc w:val="left"/>
+                    <w:jc w:val="center"/>
+                  </w:pPr>
+                  <w:r>
+                    <w:t xml:space="preserve">Kreisangehörige Gemeinde</w:t>
+                  </w:r>
+                </w:p>
+              </w:tc>
+              <w:tc>
+                <w:tcPr/>
+                <w:p>
+                  <w:pPr>
+                    <w:pStyle w:val="Compact"/>
+                    <w:jc w:val="right"/>
+                    <w:jc w:val="center"/>
+                  </w:pPr>
+                  <w:r>
+                    <w:t xml:space="preserve">1269</w:t>
+                  </w:r>
+                </w:p>
+              </w:tc>
+              <w:tc>
+                <w:tcPr/>
+                <w:p>
+                  <w:pPr>
+                    <w:pStyle w:val="Compact"/>
+                    <w:jc w:val="right"/>
+                    <w:jc w:val="center"/>
+                  </w:pPr>
+                  <w:r>
+                    <w:t xml:space="preserve">2422</w:t>
+                  </w:r>
+                </w:p>
+              </w:tc>
+              <w:tc>
+                <w:tcPr/>
+                <w:p>
+                  <w:pPr>
+                    <w:pStyle w:val="Compact"/>
+                    <w:jc w:val="left"/>
+                    <w:jc w:val="center"/>
+                  </w:pPr>
+                  <w:r>
+                    <w:t xml:space="preserve">DE</w:t>
+                  </w:r>
+                </w:p>
+              </w:tc>
+              <w:tc>
+                <w:tcPr/>
+                <w:p>
+                  <w:pPr>
+                    <w:pStyle w:val="Compact"/>
+                    <w:jc w:val="right"/>
+                    <w:jc w:val="center"/>
+                  </w:pPr>
+                  <w:r>
+                    <w:t xml:space="preserve">125.35809</w:t>
+                  </w:r>
+                </w:p>
+              </w:tc>
+              <w:tc>
+                <w:tcPr/>
+                <w:p>
+                  <w:pPr>
+                    <w:pStyle w:val="Compact"/>
+                    <w:jc w:val="right"/>
+                    <w:jc w:val="center"/>
+                  </w:pPr>
+                  <w:r>
+                    <w:t xml:space="preserve">1059.2585</w:t>
+                  </w:r>
+                </w:p>
+              </w:tc>
+            </w:tr>
+            <w:tr>
+              <w:tc>
+                <w:tcPr/>
+                <w:p>
+                  <w:pPr>
+                    <w:pStyle w:val="Compact"/>
+                    <w:jc w:val="left"/>
+                    <w:jc w:val="center"/>
+                  </w:pPr>
+                  <w:r>
+                    <w:t xml:space="preserve">08215099</w:t>
+                  </w:r>
+                </w:p>
+              </w:tc>
+              <w:tc>
+                <w:tcPr/>
+                <w:p>
+                  <w:pPr>
+                    <w:pStyle w:val="Compact"/>
+                    <w:jc w:val="left"/>
+                    <w:jc w:val="center"/>
+                  </w:pPr>
+                  <w:r>
+                    <w:t xml:space="preserve">Graben-Neudorf</w:t>
+                  </w:r>
+                </w:p>
+              </w:tc>
+              <w:tc>
+                <w:tcPr/>
+                <w:p>
+                  <w:pPr>
+                    <w:pStyle w:val="Compact"/>
+                    <w:jc w:val="left"/>
+                    <w:jc w:val="center"/>
+                  </w:pPr>
+                  <w:r>
+                    <w:t xml:space="preserve">Kreisangehörige Gemeinde</w:t>
+                  </w:r>
+                </w:p>
+              </w:tc>
+              <w:tc>
+                <w:tcPr/>
+                <w:p>
+                  <w:pPr>
+                    <w:pStyle w:val="Compact"/>
+                    <w:jc w:val="right"/>
+                    <w:jc w:val="center"/>
+                  </w:pPr>
+                  <w:r>
+                    <w:t xml:space="preserve">12277</w:t>
+                  </w:r>
+                </w:p>
+              </w:tc>
+              <w:tc>
+                <w:tcPr/>
+                <w:p>
+                  <w:pPr>
+                    <w:pStyle w:val="Compact"/>
+                    <w:jc w:val="right"/>
+                    <w:jc w:val="center"/>
+                  </w:pPr>
+                  <w:r>
+                    <w:t xml:space="preserve">2880</w:t>
+                  </w:r>
+                </w:p>
+              </w:tc>
+              <w:tc>
+                <w:tcPr/>
+                <w:p>
+                  <w:pPr>
+                    <w:pStyle w:val="Compact"/>
+                    <w:jc w:val="left"/>
+                    <w:jc w:val="center"/>
+                  </w:pPr>
+                  <w:r>
+                    <w:t xml:space="preserve">DE</w:t>
+                  </w:r>
+                </w:p>
+              </w:tc>
+              <w:tc>
+                <w:tcPr/>
+                <w:p>
+                  <w:pPr>
+                    <w:pStyle w:val="Compact"/>
+                    <w:jc w:val="right"/>
+                    <w:jc w:val="center"/>
+                  </w:pPr>
+                  <w:r>
+                    <w:t xml:space="preserve">1212.78275</w:t>
+                  </w:r>
+                </w:p>
+              </w:tc>
+              <w:tc>
+                <w:tcPr/>
+                <w:p>
+                  <w:pPr>
+                    <w:pStyle w:val="Compact"/>
+                    <w:jc w:val="right"/>
+                    <w:jc w:val="center"/>
+                  </w:pPr>
+                  <w:r>
+                    <w:t xml:space="preserve">10247.8456</w:t>
+                  </w:r>
+                </w:p>
+              </w:tc>
+            </w:tr>
+            <w:tr>
+              <w:tc>
+                <w:tcPr/>
+                <w:p>
+                  <w:pPr>
+                    <w:pStyle w:val="Compact"/>
+                    <w:jc w:val="left"/>
+                    <w:jc w:val="center"/>
+                  </w:pPr>
+                  <w:r>
+                    <w:t xml:space="preserve">08336100</w:t>
+                  </w:r>
+                </w:p>
+              </w:tc>
+              <w:tc>
+                <w:tcPr/>
+                <w:p>
+                  <w:pPr>
+                    <w:pStyle w:val="Compact"/>
+                    <w:jc w:val="left"/>
+                    <w:jc w:val="center"/>
+                  </w:pPr>
+                  <w:r>
+                    <w:t xml:space="preserve">Wittlingen</w:t>
+                  </w:r>
+                </w:p>
+              </w:tc>
+              <w:tc>
+                <w:tcPr/>
+                <w:p>
+                  <w:pPr>
+                    <w:pStyle w:val="Compact"/>
+                    <w:jc w:val="left"/>
+                    <w:jc w:val="center"/>
+                  </w:pPr>
+                  <w:r>
+                    <w:t xml:space="preserve">Kreisangehörige Gemeinde</w:t>
+                  </w:r>
+                </w:p>
+              </w:tc>
+              <w:tc>
+                <w:tcPr/>
+                <w:p>
+                  <w:pPr>
+                    <w:pStyle w:val="Compact"/>
+                    <w:jc w:val="right"/>
+                    <w:jc w:val="center"/>
+                  </w:pPr>
+                  <w:r>
+                    <w:t xml:space="preserve">913</w:t>
+                  </w:r>
+                </w:p>
+              </w:tc>
+              <w:tc>
+                <w:tcPr/>
+                <w:p>
+                  <w:pPr>
+                    <w:pStyle w:val="Compact"/>
+                    <w:jc w:val="right"/>
+                    <w:jc w:val="center"/>
+                  </w:pPr>
+                  <w:r>
+                    <w:t xml:space="preserve">450</w:t>
+                  </w:r>
+                </w:p>
+              </w:tc>
+              <w:tc>
+                <w:tcPr/>
+                <w:p>
+                  <w:pPr>
+                    <w:pStyle w:val="Compact"/>
+                    <w:jc w:val="left"/>
+                    <w:jc w:val="center"/>
+                  </w:pPr>
+                  <w:r>
+                    <w:t xml:space="preserve">DE</w:t>
+                  </w:r>
+                </w:p>
+              </w:tc>
+              <w:tc>
+                <w:tcPr/>
+                <w:p>
+                  <w:pPr>
+                    <w:pStyle w:val="Compact"/>
+                    <w:jc w:val="right"/>
+                    <w:jc w:val="center"/>
+                  </w:pPr>
+                  <w:r>
+                    <w:t xml:space="preserve">90.19065</w:t>
+                  </w:r>
+                </w:p>
+              </w:tc>
+              <w:tc>
+                <w:tcPr/>
+                <w:p>
+                  <w:pPr>
+                    <w:pStyle w:val="Compact"/>
+                    <w:jc w:val="right"/>
+                    <w:jc w:val="center"/>
+                  </w:pPr>
+                  <w:r>
+                    <w:t xml:space="preserve">762.0985</w:t>
+                  </w:r>
+                </w:p>
+              </w:tc>
+            </w:tr>
+            <w:tr>
+              <w:tc>
+                <w:tcPr/>
+                <w:p>
+                  <w:pPr>
+                    <w:pStyle w:val="Compact"/>
+                    <w:jc w:val="left"/>
+                    <w:jc w:val="center"/>
+                  </w:pPr>
+                  <w:r>
+                    <w:t xml:space="preserve">07337011</w:t>
+                  </w:r>
+                </w:p>
+              </w:tc>
+              <w:tc>
+                <w:tcPr/>
+                <w:p>
+                  <w:pPr>
+                    <w:pStyle w:val="Compact"/>
+                    <w:jc w:val="left"/>
+                    <w:jc w:val="center"/>
+                  </w:pPr>
+                  <w:r>
+                    <w:t xml:space="preserve">Böbingen</w:t>
+                  </w:r>
+                </w:p>
+              </w:tc>
+              <w:tc>
+                <w:tcPr/>
+                <w:p>
+                  <w:pPr>
+                    <w:pStyle w:val="Compact"/>
+                    <w:jc w:val="left"/>
+                    <w:jc w:val="center"/>
+                  </w:pPr>
+                  <w:r>
+                    <w:t xml:space="preserve">Kreisangehörige Gemeinde</w:t>
+                  </w:r>
+                </w:p>
+              </w:tc>
+              <w:tc>
+                <w:tcPr/>
+                <w:p>
+                  <w:pPr>
+                    <w:pStyle w:val="Compact"/>
+                    <w:jc w:val="right"/>
+                    <w:jc w:val="center"/>
+                  </w:pPr>
+                  <w:r>
+                    <w:t xml:space="preserve">760</w:t>
+                  </w:r>
+                </w:p>
+              </w:tc>
+              <w:tc>
+                <w:tcPr/>
+                <w:p>
+                  <w:pPr>
+                    <w:pStyle w:val="Compact"/>
+                    <w:jc w:val="right"/>
+                    <w:jc w:val="center"/>
+                  </w:pPr>
+                  <w:r>
+                    <w:t xml:space="preserve">691</w:t>
+                  </w:r>
+                </w:p>
+              </w:tc>
+              <w:tc>
+                <w:tcPr/>
+                <w:p>
+                  <w:pPr>
+                    <w:pStyle w:val="Compact"/>
+                    <w:jc w:val="left"/>
+                    <w:jc w:val="center"/>
+                  </w:pPr>
+                  <w:r>
+                    <w:t xml:space="preserve">DE</w:t>
+                  </w:r>
+                </w:p>
+              </w:tc>
+              <w:tc>
+                <w:tcPr/>
+                <w:p>
+                  <w:pPr>
+                    <w:pStyle w:val="Compact"/>
+                    <w:jc w:val="right"/>
+                    <w:jc w:val="center"/>
+                  </w:pPr>
+                  <w:r>
+                    <w:t xml:space="preserve">75.07656</w:t>
+                  </w:r>
+                </w:p>
+              </w:tc>
+              <w:tc>
+                <w:tcPr/>
+                <w:p>
+                  <w:pPr>
+                    <w:pStyle w:val="Compact"/>
+                    <w:jc w:val="right"/>
+                    <w:jc w:val="center"/>
+                  </w:pPr>
+                  <w:r>
+                    <w:t xml:space="preserve">634.3865</w:t>
+                  </w:r>
+                </w:p>
+              </w:tc>
+            </w:tr>
+            <w:tr>
+              <w:tc>
+                <w:tcPr/>
+                <w:p>
+                  <w:pPr>
+                    <w:pStyle w:val="Compact"/>
+                    <w:jc w:val="left"/>
+                    <w:jc w:val="center"/>
+                  </w:pPr>
+                  <w:r>
+                    <w:t xml:space="preserve">07336004</w:t>
+                  </w:r>
+                </w:p>
+              </w:tc>
+              <w:tc>
+                <w:tcPr/>
+                <w:p>
+                  <w:pPr>
+                    <w:pStyle w:val="Compact"/>
+                    <w:jc w:val="left"/>
+                    <w:jc w:val="center"/>
+                  </w:pPr>
+                  <w:r>
+                    <w:t xml:space="preserve">Altenkirchen</w:t>
+                  </w:r>
+                </w:p>
+              </w:tc>
+              <w:tc>
+                <w:tcPr/>
+                <w:p>
+                  <w:pPr>
+                    <w:pStyle w:val="Compact"/>
+                    <w:jc w:val="left"/>
+                    <w:jc w:val="center"/>
+                  </w:pPr>
+                  <w:r>
+                    <w:t xml:space="preserve">Kreisangehörige Gemeinde</w:t>
+                  </w:r>
+                </w:p>
+              </w:tc>
+              <w:tc>
+                <w:tcPr/>
+                <w:p>
+                  <w:pPr>
+                    <w:pStyle w:val="Compact"/>
+                    <w:jc w:val="right"/>
+                    <w:jc w:val="center"/>
+                  </w:pPr>
+                  <w:r>
+                    <w:t xml:space="preserve">1298</w:t>
+                  </w:r>
+                </w:p>
+              </w:tc>
+              <w:tc>
+                <w:tcPr/>
+                <w:p>
+                  <w:pPr>
+                    <w:pStyle w:val="Compact"/>
+                    <w:jc w:val="right"/>
+                    <w:jc w:val="center"/>
+                  </w:pPr>
+                  <w:r>
+                    <w:t xml:space="preserve">644</w:t>
+                  </w:r>
+                </w:p>
+              </w:tc>
+              <w:tc>
+                <w:tcPr/>
+                <w:p>
+                  <w:pPr>
+                    <w:pStyle w:val="Compact"/>
+                    <w:jc w:val="left"/>
+                    <w:jc w:val="center"/>
+                  </w:pPr>
+                  <w:r>
+                    <w:t xml:space="preserve">DE</w:t>
+                  </w:r>
+                </w:p>
+              </w:tc>
+              <w:tc>
+                <w:tcPr/>
+                <w:p>
+                  <w:pPr>
+                    <w:pStyle w:val="Compact"/>
+                    <w:jc w:val="right"/>
+                    <w:jc w:val="center"/>
+                  </w:pPr>
+                  <w:r>
+                    <w:t xml:space="preserve">128.22286</w:t>
+                  </w:r>
+                </w:p>
+              </w:tc>
+              <w:tc>
+                <w:tcPr/>
+                <w:p>
+                  <w:pPr>
+                    <w:pStyle w:val="Compact"/>
+                    <w:jc w:val="right"/>
+                    <w:jc w:val="center"/>
+                  </w:pPr>
+                  <w:r>
+                    <w:t xml:space="preserve">1083.4653</w:t>
+                  </w:r>
+                </w:p>
+              </w:tc>
+            </w:tr>
+          </w:tbl>
+          <w:bookmarkEnd w:id="9"/>
+          <w:p/>
+        </w:tc>
+      </w:tr>
+    </w:tbl>
+    <w:bookmarkEnd w:id="10"/>
+    <w:bookmarkStart w:id="26" w:name="gis-übersicht"/>
+    <w:p>
+      <w:pPr>
+        <w:pStyle w:val="Heading2"/>
+      </w:pPr>
+      <w:r>
+        <w:t xml:space="preserve">GIS-Übersicht</w:t>
+      </w:r>
+    </w:p>
+    <w:p>
+      <w:pPr>
+        <w:pStyle w:val="FirstParagraph"/>
+      </w:pPr>
+      <w:r>
         <w:t xml:space="preserve">Ich lade hier die</w:t>
       </w:r>
       <w:r>
         <w:t xml:space="preserve"> </w:t>
       </w:r>
-      <w:hyperlink r:id="rId20">
+      <w:hyperlink r:id="rId11">
         <w:r>
           <w:rPr>
             <w:rStyle w:val="Hyperlink"/>
@@ -135,18 +915,18 @@
           <wp:inline>
             <wp:extent cx="4620126" cy="3696101"/>
             <wp:effectExtent b="0" l="0" r="0" t="0"/>
-            <wp:docPr descr="" title="" id="22" name="Picture"/>
+            <wp:docPr descr="" title="" id="13" name="Picture"/>
             <a:graphic>
               <a:graphicData uri="http://schemas.openxmlformats.org/drawingml/2006/picture">
                 <pic:pic>
                   <pic:nvPicPr>
-                    <pic:cNvPr descr="02_prepare_area_data_files/figure-docx/vg250_laden-1.png" id="23" name="Picture"/>
+                    <pic:cNvPr descr="02_prepare_area_data_files/figure-docx/vg250_laden-1.png" id="14" name="Picture"/>
                     <pic:cNvPicPr>
                       <a:picLocks noChangeArrowheads="1" noChangeAspect="1"/>
                     </pic:cNvPicPr>
                   </pic:nvPicPr>
                   <pic:blipFill>
-                    <a:blip r:embed="rId21"/>
+                    <a:blip r:embed="rId12"/>
                     <a:stretch>
                       <a:fillRect/>
                     </a:stretch>
@@ -190,18 +970,18 @@
           <wp:inline>
             <wp:extent cx="4620126" cy="3696101"/>
             <wp:effectExtent b="0" l="0" r="0" t="0"/>
-            <wp:docPr descr="" title="" id="25" name="Picture"/>
+            <wp:docPr descr="" title="" id="16" name="Picture"/>
             <a:graphic>
               <a:graphicData uri="http://schemas.openxmlformats.org/drawingml/2006/picture">
                 <pic:pic>
                   <pic:nvPicPr>
-                    <pic:cNvPr descr="02_prepare_area_data_files/figure-docx/Bevoelkerungsdichtekarte-1.png" id="26" name="Picture"/>
+                    <pic:cNvPr descr="02_prepare_area_data_files/figure-docx/Bevoelkerungsdichtekarte-1.png" id="17" name="Picture"/>
                     <pic:cNvPicPr>
                       <a:picLocks noChangeArrowheads="1" noChangeAspect="1"/>
                     </pic:cNvPicPr>
                   </pic:nvPicPr>
                   <pic:blipFill>
-                    <a:blip r:embed="rId24"/>
+                    <a:blip r:embed="rId15"/>
                     <a:stretch>
                       <a:fillRect/>
                     </a:stretch>
@@ -635,7 +1415,7 @@
         <w:pStyle w:val="FirstParagraph"/>
       </w:pPr>
       <w:r>
-        <w:t xml:space="preserve">Zusammen mit den Informationen aus der im ersten Schritt generierten Tabelle lässt sich beispielsweise eine Bevölkerungdichtekarte darstellen:</w:t>
+        <w:t xml:space="preserve">Zusammen mit den Informationen aus der im ersten Schritt generierten Tabelle lässt sich beispielsweise eine Kinder-Bevölkerungdichtekarte (von 7-17 Jahren) darstellen:</w:t>
       </w:r>
     </w:p>
     <w:p>
@@ -647,18 +1427,18 @@
           <wp:inline>
             <wp:extent cx="4620126" cy="3696101"/>
             <wp:effectExtent b="0" l="0" r="0" t="0"/>
-            <wp:docPr descr="" title="" id="28" name="Picture"/>
+            <wp:docPr descr="" title="" id="19" name="Picture"/>
             <a:graphic>
               <a:graphicData uri="http://schemas.openxmlformats.org/drawingml/2006/picture">
                 <pic:pic>
                   <pic:nvPicPr>
-                    <pic:cNvPr descr="02_prepare_area_data_files/figure-docx/gis_visualisierung_vg250-1.png" id="29" name="Picture"/>
+                    <pic:cNvPr descr="02_prepare_area_data_files/figure-docx/gis_visualisierung_vg250-1.png" id="20" name="Picture"/>
                     <pic:cNvPicPr>
                       <a:picLocks noChangeArrowheads="1" noChangeAspect="1"/>
                     </pic:cNvPicPr>
                   </pic:nvPicPr>
                   <pic:blipFill>
-                    <a:blip r:embed="rId27"/>
+                    <a:blip r:embed="rId18"/>
                     <a:stretch>
                       <a:fillRect/>
                     </a:stretch>
@@ -690,6 +1470,181 @@
         <w:pStyle w:val="BodyText"/>
       </w:pPr>
       <w:r>
+        <w:t xml:space="preserve">In</w:t>
+      </w:r>
+      <w:r>
+        <w:t xml:space="preserve"> </w:t>
+      </w:r>
+      <w:r>
+        <w:rPr>
+          <w:b/>
+          <w:bCs/>
+        </w:rPr>
+        <w:t xml:space="preserve">?@fig-Daten_Bevoelkerung-Vgl</w:t>
+      </w:r>
+      <w:r>
+        <w:t xml:space="preserve"> </w:t>
+      </w:r>
+      <w:r>
+        <w:t xml:space="preserve">werden die Bevölkerungsdaten aus den beiden Quellen verglichen - man erwartet keine Abweichung. Abweichungen würden auf unterschiedliche Datenstände oder sonstige Probleme hinweisen.</w:t>
+      </w:r>
+    </w:p>
+    <w:tbl>
+      <w:tblPr>
+        <w:tblStyle w:val="Table"/>
+        <w:tblW w:type="pct" w:w="5000"/>
+        <w:tblLayout w:type="fixed"/>
+        <w:tblLook w:firstRow="0" w:lastRow="0" w:firstColumn="0" w:lastColumn="0" w:noHBand="0" w:noVBand="0" w:val="0000"/>
+      </w:tblPr>
+      <w:tblGrid>
+        <w:gridCol w:w="7920"/>
+      </w:tblGrid>
+      <w:tr>
+        <w:tc>
+          <w:tcPr/>
+          <w:bookmarkStart w:id="25" w:name="fig-Daten_Bevoelkerung_Vgl"/>
+          <w:p>
+            <w:pPr>
+              <w:pStyle w:val="Compact"/>
+              <w:jc w:val="center"/>
+            </w:pPr>
+            <w:bookmarkStart w:id="24" w:name="fig-Daten_Bevoelkerung_Vgl"/>
+            <w:r>
+              <w:drawing>
+                <wp:inline>
+                  <wp:extent cx="4620126" cy="3696101"/>
+                  <wp:effectExtent b="0" l="0" r="0" t="0"/>
+                  <wp:docPr descr="" title="" id="22" name="Picture"/>
+                  <a:graphic>
+                    <a:graphicData uri="http://schemas.openxmlformats.org/drawingml/2006/picture">
+                      <pic:pic>
+                        <pic:nvPicPr>
+                          <pic:cNvPr descr="02_prepare_area_data_files/figure-docx/fig-Daten_Bevoelkerung_Vgl-1.png" id="23" name="Picture"/>
+                          <pic:cNvPicPr>
+                            <a:picLocks noChangeArrowheads="1" noChangeAspect="1"/>
+                          </pic:cNvPicPr>
+                        </pic:nvPicPr>
+                        <pic:blipFill>
+                          <a:blip r:embed="rId21"/>
+                          <a:stretch>
+                            <a:fillRect/>
+                          </a:stretch>
+                        </pic:blipFill>
+                        <pic:spPr bwMode="auto">
+                          <a:xfrm>
+                            <a:off x="0" y="0"/>
+                            <a:ext cx="4620126" cy="3696101"/>
+                          </a:xfrm>
+                          <a:prstGeom prst="rect">
+                            <a:avLst/>
+                          </a:prstGeom>
+                          <a:noFill/>
+                          <a:ln w="9525">
+                            <a:noFill/>
+                            <a:headEnd/>
+                            <a:tailEnd/>
+                          </a:ln>
+                        </pic:spPr>
+                      </pic:pic>
+                    </a:graphicData>
+                  </a:graphic>
+                </wp:inline>
+              </w:drawing>
+            </w:r>
+            <w:bookmarkEnd w:id="24"/>
+          </w:p>
+          <w:p>
+            <w:pPr>
+              <w:jc w:val="center"/>
+            </w:pPr>
+            <w:pPr>
+              <w:jc w:val="left"/>
+              <w:spacing w:before="200"/>
+              <w:pStyle w:val="ImageCaption"/>
+            </w:pPr>
+            <w:r>
+              <w:t xml:space="preserve">Figure 1</w:t>
+            </w:r>
+          </w:p>
+          <w:bookmarkEnd w:id="25"/>
+        </w:tc>
+      </w:tr>
+    </w:tbl>
+    <w:bookmarkEnd w:id="26"/>
+    <w:bookmarkStart w:id="29" w:name="europäische-geodaten"/>
+    <w:p>
+      <w:pPr>
+        <w:pStyle w:val="Heading2"/>
+      </w:pPr>
+      <w:r>
+        <w:t xml:space="preserve">Europäische Geodaten</w:t>
+      </w:r>
+    </w:p>
+    <w:p>
+      <w:pPr>
+        <w:pStyle w:val="FirstParagraph"/>
+      </w:pPr>
+      <w:r>
+        <w:t xml:space="preserve">Unter</w:t>
+      </w:r>
+      <w:r>
+        <w:t xml:space="preserve"> </w:t>
+      </w:r>
+      <w:hyperlink r:id="rId27">
+        <w:r>
+          <w:rPr>
+            <w:rStyle w:val="Hyperlink"/>
+          </w:rPr>
+          <w:t xml:space="preserve">NUTS3 Geodaten der Europäischen Kommission</w:t>
+        </w:r>
+      </w:hyperlink>
+      <w:r>
+        <w:t xml:space="preserve"> </w:t>
+      </w:r>
+      <w:r>
+        <w:t xml:space="preserve">und</w:t>
+      </w:r>
+      <w:r>
+        <w:t xml:space="preserve"> </w:t>
+      </w:r>
+      <w:hyperlink r:id="rId28">
+        <w:r>
+          <w:rPr>
+            <w:rStyle w:val="Hyperlink"/>
+          </w:rPr>
+          <w:t xml:space="preserve">NUT3 Klassifikation der Europäischen Kommission</w:t>
+        </w:r>
+      </w:hyperlink>
+      <w:r>
+        <w:t xml:space="preserve"> </w:t>
+      </w:r>
+      <w:r>
+        <w:t xml:space="preserve">finden sich die relevanten Geodaten /-tabellen für die mit einem europäischen ID-System.</w:t>
+      </w:r>
+    </w:p>
+    <w:bookmarkEnd w:id="29"/>
+    <w:bookmarkStart w:id="33" w:name="expositionsdaten-räumlich-visualisieren"/>
+    <w:p>
+      <w:pPr>
+        <w:pStyle w:val="Heading2"/>
+      </w:pPr>
+      <w:r>
+        <w:t xml:space="preserve">Expositionsdaten räumlich visualisieren</w:t>
+      </w:r>
+    </w:p>
+    <w:p>
+      <w:pPr>
+        <w:pStyle w:val="FirstParagraph"/>
+      </w:pPr>
+      <w:r>
+        <w:t xml:space="preserve">Am Beispiel von Hessen wird der Umfang der Expositionsinformationen der verschiedenen Datenquellen visualiert:</w:t>
+      </w:r>
+    </w:p>
+    <w:p>
+      <w:pPr>
+        <w:pStyle w:val="BodyText"/>
+      </w:pPr>
+      <w:r>
         <w:drawing>
           <wp:inline>
             <wp:extent cx="4620126" cy="3696101"/>
@@ -699,7 +1654,7 @@
               <a:graphicData uri="http://schemas.openxmlformats.org/drawingml/2006/picture">
                 <pic:pic>
                   <pic:nvPicPr>
-                    <pic:cNvPr descr="02_prepare_area_data_files/figure-docx/Daten_Bevoelkerung_Vgl-1.png" id="32" name="Picture"/>
+                    <pic:cNvPr descr="02_prepare_area_data_files/figure-docx/gis_expositionsdaten_plotten-1.png" id="32" name="Picture"/>
                     <pic:cNvPicPr>
                       <a:picLocks noChangeArrowheads="1" noChangeAspect="1"/>
                     </pic:cNvPicPr>
@@ -733,71 +1688,6 @@
       </w:r>
     </w:p>
     <w:bookmarkEnd w:id="33"/>
-    <w:bookmarkStart w:id="37" w:name="expositionsdaten-räumlich-visualisieren"/>
-    <w:p>
-      <w:pPr>
-        <w:pStyle w:val="Heading2"/>
-      </w:pPr>
-      <w:r>
-        <w:t xml:space="preserve">Expositionsdaten räumlich visualisieren</w:t>
-      </w:r>
-    </w:p>
-    <w:p>
-      <w:pPr>
-        <w:pStyle w:val="FirstParagraph"/>
-      </w:pPr>
-      <w:r>
-        <w:t xml:space="preserve">Am Beispiel von Hessen wird der Umfang der Expositionsinformationen der verschiedenen Datenquellen visualiert:</w:t>
-      </w:r>
-    </w:p>
-    <w:p>
-      <w:pPr>
-        <w:pStyle w:val="BodyText"/>
-      </w:pPr>
-      <w:r>
-        <w:drawing>
-          <wp:inline>
-            <wp:extent cx="4620126" cy="3696101"/>
-            <wp:effectExtent b="0" l="0" r="0" t="0"/>
-            <wp:docPr descr="" title="" id="35" name="Picture"/>
-            <a:graphic>
-              <a:graphicData uri="http://schemas.openxmlformats.org/drawingml/2006/picture">
-                <pic:pic>
-                  <pic:nvPicPr>
-                    <pic:cNvPr descr="02_prepare_area_data_files/figure-docx/gis_expositionsdaten_plotten-1.png" id="36" name="Picture"/>
-                    <pic:cNvPicPr>
-                      <a:picLocks noChangeArrowheads="1" noChangeAspect="1"/>
-                    </pic:cNvPicPr>
-                  </pic:nvPicPr>
-                  <pic:blipFill>
-                    <a:blip r:embed="rId34"/>
-                    <a:stretch>
-                      <a:fillRect/>
-                    </a:stretch>
-                  </pic:blipFill>
-                  <pic:spPr bwMode="auto">
-                    <a:xfrm>
-                      <a:off x="0" y="0"/>
-                      <a:ext cx="4620126" cy="3696101"/>
-                    </a:xfrm>
-                    <a:prstGeom prst="rect">
-                      <a:avLst/>
-                    </a:prstGeom>
-                    <a:noFill/>
-                    <a:ln w="9525">
-                      <a:noFill/>
-                      <a:headEnd/>
-                      <a:tailEnd/>
-                    </a:ln>
-                  </pic:spPr>
-                </pic:pic>
-              </a:graphicData>
-            </a:graphic>
-          </wp:inline>
-        </w:drawing>
-      </w:r>
-    </w:p>
-    <w:bookmarkEnd w:id="37"/>
     <w:sectPr>
       <w:footnotePr>
         <w:numRestart w:val="eachSect"/>
@@ -919,10 +1809,10 @@
   <w:docDefaults>
     <w:rPrDefault>
       <w:rPr>
-        <w:rFonts w:asciiTheme="minorHAnsi" w:cstheme="minorBidi" w:eastAsiaTheme="minorHAnsi" w:hAnsiTheme="minorHAnsi"/>
+        <w:rFonts w:asciiTheme="minorHAnsi" w:cstheme="minorBidi" w:eastAsiaTheme="minorEastAsia" w:hAnsiTheme="minorHAnsi"/>
         <w:sz w:val="24"/>
         <w:szCs w:val="24"/>
-        <w:lang w:bidi="ar-SA" w:eastAsia="en-US" w:val="en-US"/>
+        <w:lang w:bidi="ar-SA" w:eastAsia="zh-CN" w:val="en-US"/>
       </w:rPr>
     </w:rPrDefault>
     <w:pPrDefault>
@@ -1463,13 +2353,6 @@
       </w:tblCellMar>
     </w:tblPr>
     <w:tblStylePr w:type="firstRow">
-      <w:tblPr>
-        <w:jc w:val="left"/>
-        <w:tblInd w:type="dxa" w:w="0"/>
-      </w:tblPr>
-      <w:trPr>
-        <w:jc w:val="left"/>
-      </w:trPr>
       <w:tcPr>
         <w:tcBorders>
           <w:bottom w:val="single"/>

</xml_diff>

<commit_message>
finish incomplete Variable renaming
</commit_message>
<xml_diff>
--- a/02_prepare_area_data.docx
+++ b/02_prepare_area_data.docx
@@ -138,19 +138,21 @@
           <w:tbl>
             <w:tblPr>
               <w:tblStyle w:val="Table"/>
-              <w:tblW w:type="pct" w:w="5100"/>
+              <w:tblW w:type="pct" w:w="5200"/>
               <w:tblLayout w:type="fixed"/>
               <w:tblLook w:firstRow="1" w:lastRow="0" w:firstColumn="0" w:lastColumn="0" w:noHBand="0" w:noVBand="0" w:val="0020"/>
             </w:tblPr>
             <w:tblGrid>
-              <w:gridCol w:w="1425"/>
-              <w:gridCol w:w="950"/>
-              <w:gridCol w:w="950"/>
-              <w:gridCol w:w="950"/>
-              <w:gridCol w:w="950"/>
-              <w:gridCol w:w="950"/>
-              <w:gridCol w:w="950"/>
-              <w:gridCol w:w="950"/>
+              <w:gridCol w:w="1108"/>
+              <w:gridCol w:w="792"/>
+              <w:gridCol w:w="792"/>
+              <w:gridCol w:w="792"/>
+              <w:gridCol w:w="792"/>
+              <w:gridCol w:w="792"/>
+              <w:gridCol w:w="792"/>
+              <w:gridCol w:w="792"/>
+              <w:gridCol w:w="792"/>
+              <w:gridCol w:w="792"/>
             </w:tblGrid>
             <w:tr>
               <w:trPr>
@@ -243,6 +245,32 @@
                     <w:jc w:val="center"/>
                   </w:pPr>
                   <w:r>
+                    <w:t xml:space="preserve">fraction_children_7_17_years</w:t>
+                  </w:r>
+                </w:p>
+              </w:tc>
+              <w:tc>
+                <w:tcPr/>
+                <w:p>
+                  <w:pPr>
+                    <w:pStyle w:val="Compact"/>
+                    <w:jc w:val="right"/>
+                    <w:jc w:val="center"/>
+                  </w:pPr>
+                  <w:r>
+                    <w:t xml:space="preserve">fraction_adults_from_18_years</w:t>
+                  </w:r>
+                </w:p>
+              </w:tc>
+              <w:tc>
+                <w:tcPr/>
+                <w:p>
+                  <w:pPr>
+                    <w:pStyle w:val="Compact"/>
+                    <w:jc w:val="right"/>
+                    <w:jc w:val="center"/>
+                  </w:pPr>
+                  <w:r>
                     <w:t xml:space="preserve">bev_7_17</w:t>
                   </w:r>
                 </w:p>
@@ -271,7 +299,7 @@
                     <w:jc w:val="center"/>
                   </w:pPr>
                   <w:r>
-                    <w:t xml:space="preserve">09571227</w:t>
+                    <w:t xml:space="preserve">07336011</w:t>
                   </w:r>
                 </w:p>
               </w:tc>
@@ -284,7 +312,7 @@
                     <w:jc w:val="center"/>
                   </w:pPr>
                   <w:r>
-                    <w:t xml:space="preserve">Wittelshofen</w:t>
+                    <w:t xml:space="preserve">Brücken (Pfalz)</w:t>
                   </w:r>
                 </w:p>
               </w:tc>
@@ -310,20 +338,20 @@
                     <w:jc w:val="center"/>
                   </w:pPr>
                   <w:r>
-                    <w:t xml:space="preserve">1269</w:t>
-                  </w:r>
-                </w:p>
-              </w:tc>
-              <w:tc>
-                <w:tcPr/>
-                <w:p>
-                  <w:pPr>
-                    <w:pStyle w:val="Compact"/>
-                    <w:jc w:val="right"/>
-                    <w:jc w:val="center"/>
-                  </w:pPr>
-                  <w:r>
-                    <w:t xml:space="preserve">2422</w:t>
+                    <w:t xml:space="preserve">2082</w:t>
+                  </w:r>
+                </w:p>
+              </w:tc>
+              <w:tc>
+                <w:tcPr/>
+                <w:p>
+                  <w:pPr>
+                    <w:pStyle w:val="Compact"/>
+                    <w:jc w:val="right"/>
+                    <w:jc w:val="center"/>
+                  </w:pPr>
+                  <w:r>
+                    <w:t xml:space="preserve">812</w:t>
                   </w:r>
                 </w:p>
               </w:tc>
@@ -349,20 +377,46 @@
                     <w:jc w:val="center"/>
                   </w:pPr>
                   <w:r>
-                    <w:t xml:space="preserve">125.35809</w:t>
-                  </w:r>
-                </w:p>
-              </w:tc>
-              <w:tc>
-                <w:tcPr/>
-                <w:p>
-                  <w:pPr>
-                    <w:pStyle w:val="Compact"/>
-                    <w:jc w:val="right"/>
-                    <w:jc w:val="center"/>
-                  </w:pPr>
-                  <w:r>
-                    <w:t xml:space="preserve">1059.2585</w:t>
+                    <w:t xml:space="preserve">0.0987849</w:t>
+                  </w:r>
+                </w:p>
+              </w:tc>
+              <w:tc>
+                <w:tcPr/>
+                <w:p>
+                  <w:pPr>
+                    <w:pStyle w:val="Compact"/>
+                    <w:jc w:val="right"/>
+                    <w:jc w:val="center"/>
+                  </w:pPr>
+                  <w:r>
+                    <w:t xml:space="preserve">0.834719</w:t>
+                  </w:r>
+                </w:p>
+              </w:tc>
+              <w:tc>
+                <w:tcPr/>
+                <w:p>
+                  <w:pPr>
+                    <w:pStyle w:val="Compact"/>
+                    <w:jc w:val="right"/>
+                    <w:jc w:val="center"/>
+                  </w:pPr>
+                  <w:r>
+                    <w:t xml:space="preserve">205.67025</w:t>
+                  </w:r>
+                </w:p>
+              </w:tc>
+              <w:tc>
+                <w:tcPr/>
+                <w:p>
+                  <w:pPr>
+                    <w:pStyle w:val="Compact"/>
+                    <w:jc w:val="right"/>
+                    <w:jc w:val="center"/>
+                  </w:pPr>
+                  <w:r>
+                    <w:t xml:space="preserve">1737.8850</w:t>
                   </w:r>
                 </w:p>
               </w:tc>
@@ -377,7 +431,7 @@
                     <w:jc w:val="center"/>
                   </w:pPr>
                   <w:r>
-                    <w:t xml:space="preserve">08215099</w:t>
+                    <w:t xml:space="preserve">09677120</w:t>
                   </w:r>
                 </w:p>
               </w:tc>
@@ -390,7 +444,7 @@
                     <w:jc w:val="center"/>
                   </w:pPr>
                   <w:r>
-                    <w:t xml:space="preserve">Graben-Neudorf</w:t>
+                    <w:t xml:space="preserve">Bischbrunn</w:t>
                   </w:r>
                 </w:p>
               </w:tc>
@@ -416,20 +470,20 @@
                     <w:jc w:val="center"/>
                   </w:pPr>
                   <w:r>
-                    <w:t xml:space="preserve">12277</w:t>
-                  </w:r>
-                </w:p>
-              </w:tc>
-              <w:tc>
-                <w:tcPr/>
-                <w:p>
-                  <w:pPr>
-                    <w:pStyle w:val="Compact"/>
-                    <w:jc w:val="right"/>
-                    <w:jc w:val="center"/>
-                  </w:pPr>
-                  <w:r>
-                    <w:t xml:space="preserve">2880</w:t>
+                    <w:t xml:space="preserve">1803</w:t>
+                  </w:r>
+                </w:p>
+              </w:tc>
+              <w:tc>
+                <w:tcPr/>
+                <w:p>
+                  <w:pPr>
+                    <w:pStyle w:val="Compact"/>
+                    <w:jc w:val="right"/>
+                    <w:jc w:val="center"/>
+                  </w:pPr>
+                  <w:r>
+                    <w:t xml:space="preserve">3696</w:t>
                   </w:r>
                 </w:p>
               </w:tc>
@@ -455,20 +509,46 @@
                     <w:jc w:val="center"/>
                   </w:pPr>
                   <w:r>
-                    <w:t xml:space="preserve">1212.78275</w:t>
-                  </w:r>
-                </w:p>
-              </w:tc>
-              <w:tc>
-                <w:tcPr/>
-                <w:p>
-                  <w:pPr>
-                    <w:pStyle w:val="Compact"/>
-                    <w:jc w:val="right"/>
-                    <w:jc w:val="center"/>
-                  </w:pPr>
-                  <w:r>
-                    <w:t xml:space="preserve">10247.8456</w:t>
+                    <w:t xml:space="preserve">0.0987849</w:t>
+                  </w:r>
+                </w:p>
+              </w:tc>
+              <w:tc>
+                <w:tcPr/>
+                <w:p>
+                  <w:pPr>
+                    <w:pStyle w:val="Compact"/>
+                    <w:jc w:val="right"/>
+                    <w:jc w:val="center"/>
+                  </w:pPr>
+                  <w:r>
+                    <w:t xml:space="preserve">0.834719</w:t>
+                  </w:r>
+                </w:p>
+              </w:tc>
+              <w:tc>
+                <w:tcPr/>
+                <w:p>
+                  <w:pPr>
+                    <w:pStyle w:val="Compact"/>
+                    <w:jc w:val="right"/>
+                    <w:jc w:val="center"/>
+                  </w:pPr>
+                  <w:r>
+                    <w:t xml:space="preserve">178.10925</w:t>
+                  </w:r>
+                </w:p>
+              </w:tc>
+              <w:tc>
+                <w:tcPr/>
+                <w:p>
+                  <w:pPr>
+                    <w:pStyle w:val="Compact"/>
+                    <w:jc w:val="right"/>
+                    <w:jc w:val="center"/>
+                  </w:pPr>
+                  <w:r>
+                    <w:t xml:space="preserve">1504.9984</w:t>
                   </w:r>
                 </w:p>
               </w:tc>
@@ -483,7 +563,7 @@
                     <w:jc w:val="center"/>
                   </w:pPr>
                   <w:r>
-                    <w:t xml:space="preserve">08336100</w:t>
+                    <w:t xml:space="preserve">01058130</w:t>
                   </w:r>
                 </w:p>
               </w:tc>
@@ -496,7 +576,7 @@
                     <w:jc w:val="center"/>
                   </w:pPr>
                   <w:r>
-                    <w:t xml:space="preserve">Wittlingen</w:t>
+                    <w:t xml:space="preserve">Quarnbek</w:t>
                   </w:r>
                 </w:p>
               </w:tc>
@@ -522,20 +602,20 @@
                     <w:jc w:val="center"/>
                   </w:pPr>
                   <w:r>
-                    <w:t xml:space="preserve">913</w:t>
-                  </w:r>
-                </w:p>
-              </w:tc>
-              <w:tc>
-                <w:tcPr/>
-                <w:p>
-                  <w:pPr>
-                    <w:pStyle w:val="Compact"/>
-                    <w:jc w:val="right"/>
-                    <w:jc w:val="center"/>
-                  </w:pPr>
-                  <w:r>
-                    <w:t xml:space="preserve">450</w:t>
+                    <w:t xml:space="preserve">1770</w:t>
+                  </w:r>
+                </w:p>
+              </w:tc>
+              <w:tc>
+                <w:tcPr/>
+                <w:p>
+                  <w:pPr>
+                    <w:pStyle w:val="Compact"/>
+                    <w:jc w:val="right"/>
+                    <w:jc w:val="center"/>
+                  </w:pPr>
+                  <w:r>
+                    <w:t xml:space="preserve">1618</w:t>
                   </w:r>
                 </w:p>
               </w:tc>
@@ -561,20 +641,46 @@
                     <w:jc w:val="center"/>
                   </w:pPr>
                   <w:r>
-                    <w:t xml:space="preserve">90.19065</w:t>
-                  </w:r>
-                </w:p>
-              </w:tc>
-              <w:tc>
-                <w:tcPr/>
-                <w:p>
-                  <w:pPr>
-                    <w:pStyle w:val="Compact"/>
-                    <w:jc w:val="right"/>
-                    <w:jc w:val="center"/>
-                  </w:pPr>
-                  <w:r>
-                    <w:t xml:space="preserve">762.0985</w:t>
+                    <w:t xml:space="preserve">0.0987849</w:t>
+                  </w:r>
+                </w:p>
+              </w:tc>
+              <w:tc>
+                <w:tcPr/>
+                <w:p>
+                  <w:pPr>
+                    <w:pStyle w:val="Compact"/>
+                    <w:jc w:val="right"/>
+                    <w:jc w:val="center"/>
+                  </w:pPr>
+                  <w:r>
+                    <w:t xml:space="preserve">0.834719</w:t>
+                  </w:r>
+                </w:p>
+              </w:tc>
+              <w:tc>
+                <w:tcPr/>
+                <w:p>
+                  <w:pPr>
+                    <w:pStyle w:val="Compact"/>
+                    <w:jc w:val="right"/>
+                    <w:jc w:val="center"/>
+                  </w:pPr>
+                  <w:r>
+                    <w:t xml:space="preserve">174.84935</w:t>
+                  </w:r>
+                </w:p>
+              </w:tc>
+              <w:tc>
+                <w:tcPr/>
+                <w:p>
+                  <w:pPr>
+                    <w:pStyle w:val="Compact"/>
+                    <w:jc w:val="right"/>
+                    <w:jc w:val="center"/>
+                  </w:pPr>
+                  <w:r>
+                    <w:t xml:space="preserve">1477.4527</w:t>
                   </w:r>
                 </w:p>
               </w:tc>
@@ -589,7 +695,7 @@
                     <w:jc w:val="center"/>
                   </w:pPr>
                   <w:r>
-                    <w:t xml:space="preserve">07337011</w:t>
+                    <w:t xml:space="preserve">07135056</w:t>
                   </w:r>
                 </w:p>
               </w:tc>
@@ -602,7 +708,7 @@
                     <w:jc w:val="center"/>
                   </w:pPr>
                   <w:r>
-                    <w:t xml:space="preserve">Böbingen</w:t>
+                    <w:t xml:space="preserve">Lütz</w:t>
                   </w:r>
                 </w:p>
               </w:tc>
@@ -628,20 +734,20 @@
                     <w:jc w:val="center"/>
                   </w:pPr>
                   <w:r>
-                    <w:t xml:space="preserve">760</w:t>
-                  </w:r>
-                </w:p>
-              </w:tc>
-              <w:tc>
-                <w:tcPr/>
-                <w:p>
-                  <w:pPr>
-                    <w:pStyle w:val="Compact"/>
-                    <w:jc w:val="right"/>
-                    <w:jc w:val="center"/>
-                  </w:pPr>
-                  <w:r>
-                    <w:t xml:space="preserve">691</w:t>
+                    <w:t xml:space="preserve">270</w:t>
+                  </w:r>
+                </w:p>
+              </w:tc>
+              <w:tc>
+                <w:tcPr/>
+                <w:p>
+                  <w:pPr>
+                    <w:pStyle w:val="Compact"/>
+                    <w:jc w:val="right"/>
+                    <w:jc w:val="center"/>
+                  </w:pPr>
+                  <w:r>
+                    <w:t xml:space="preserve">548</w:t>
                   </w:r>
                 </w:p>
               </w:tc>
@@ -667,20 +773,46 @@
                     <w:jc w:val="center"/>
                   </w:pPr>
                   <w:r>
-                    <w:t xml:space="preserve">75.07656</w:t>
-                  </w:r>
-                </w:p>
-              </w:tc>
-              <w:tc>
-                <w:tcPr/>
-                <w:p>
-                  <w:pPr>
-                    <w:pStyle w:val="Compact"/>
-                    <w:jc w:val="right"/>
-                    <w:jc w:val="center"/>
-                  </w:pPr>
-                  <w:r>
-                    <w:t xml:space="preserve">634.3865</w:t>
+                    <w:t xml:space="preserve">0.0987849</w:t>
+                  </w:r>
+                </w:p>
+              </w:tc>
+              <w:tc>
+                <w:tcPr/>
+                <w:p>
+                  <w:pPr>
+                    <w:pStyle w:val="Compact"/>
+                    <w:jc w:val="right"/>
+                    <w:jc w:val="center"/>
+                  </w:pPr>
+                  <w:r>
+                    <w:t xml:space="preserve">0.834719</w:t>
+                  </w:r>
+                </w:p>
+              </w:tc>
+              <w:tc>
+                <w:tcPr/>
+                <w:p>
+                  <w:pPr>
+                    <w:pStyle w:val="Compact"/>
+                    <w:jc w:val="right"/>
+                    <w:jc w:val="center"/>
+                  </w:pPr>
+                  <w:r>
+                    <w:t xml:space="preserve">26.67193</w:t>
+                  </w:r>
+                </w:p>
+              </w:tc>
+              <w:tc>
+                <w:tcPr/>
+                <w:p>
+                  <w:pPr>
+                    <w:pStyle w:val="Compact"/>
+                    <w:jc w:val="right"/>
+                    <w:jc w:val="center"/>
+                  </w:pPr>
+                  <w:r>
+                    <w:t xml:space="preserve">225.3741</w:t>
                   </w:r>
                 </w:p>
               </w:tc>
@@ -695,7 +827,7 @@
                     <w:jc w:val="center"/>
                   </w:pPr>
                   <w:r>
-                    <w:t xml:space="preserve">07336004</w:t>
+                    <w:t xml:space="preserve">07133031</w:t>
                   </w:r>
                 </w:p>
               </w:tc>
@@ -708,7 +840,7 @@
                     <w:jc w:val="center"/>
                   </w:pPr>
                   <w:r>
-                    <w:t xml:space="preserve">Altenkirchen</w:t>
+                    <w:t xml:space="preserve">Frei-Laubersheim</w:t>
                   </w:r>
                 </w:p>
               </w:tc>
@@ -734,20 +866,20 @@
                     <w:jc w:val="center"/>
                   </w:pPr>
                   <w:r>
-                    <w:t xml:space="preserve">1298</w:t>
-                  </w:r>
-                </w:p>
-              </w:tc>
-              <w:tc>
-                <w:tcPr/>
-                <w:p>
-                  <w:pPr>
-                    <w:pStyle w:val="Compact"/>
-                    <w:jc w:val="right"/>
-                    <w:jc w:val="center"/>
-                  </w:pPr>
-                  <w:r>
-                    <w:t xml:space="preserve">644</w:t>
+                    <w:t xml:space="preserve">1021</w:t>
+                  </w:r>
+                </w:p>
+              </w:tc>
+              <w:tc>
+                <w:tcPr/>
+                <w:p>
+                  <w:pPr>
+                    <w:pStyle w:val="Compact"/>
+                    <w:jc w:val="right"/>
+                    <w:jc w:val="center"/>
+                  </w:pPr>
+                  <w:r>
+                    <w:t xml:space="preserve">988</w:t>
                   </w:r>
                 </w:p>
               </w:tc>
@@ -773,20 +905,46 @@
                     <w:jc w:val="center"/>
                   </w:pPr>
                   <w:r>
-                    <w:t xml:space="preserve">128.22286</w:t>
-                  </w:r>
-                </w:p>
-              </w:tc>
-              <w:tc>
-                <w:tcPr/>
-                <w:p>
-                  <w:pPr>
-                    <w:pStyle w:val="Compact"/>
-                    <w:jc w:val="right"/>
-                    <w:jc w:val="center"/>
-                  </w:pPr>
-                  <w:r>
-                    <w:t xml:space="preserve">1083.4653</w:t>
+                    <w:t xml:space="preserve">0.0987849</w:t>
+                  </w:r>
+                </w:p>
+              </w:tc>
+              <w:tc>
+                <w:tcPr/>
+                <w:p>
+                  <w:pPr>
+                    <w:pStyle w:val="Compact"/>
+                    <w:jc w:val="right"/>
+                    <w:jc w:val="center"/>
+                  </w:pPr>
+                  <w:r>
+                    <w:t xml:space="preserve">0.834719</w:t>
+                  </w:r>
+                </w:p>
+              </w:tc>
+              <w:tc>
+                <w:tcPr/>
+                <w:p>
+                  <w:pPr>
+                    <w:pStyle w:val="Compact"/>
+                    <w:jc w:val="right"/>
+                    <w:jc w:val="center"/>
+                  </w:pPr>
+                  <w:r>
+                    <w:t xml:space="preserve">100.85943</w:t>
+                  </w:r>
+                </w:p>
+              </w:tc>
+              <w:tc>
+                <w:tcPr/>
+                <w:p>
+                  <w:pPr>
+                    <w:pStyle w:val="Compact"/>
+                    <w:jc w:val="right"/>
+                    <w:jc w:val="center"/>
+                  </w:pPr>
+                  <w:r>
+                    <w:t xml:space="preserve">852.2481</w:t>
                   </w:r>
                 </w:p>
               </w:tc>

</xml_diff>